<commit_message>
Fix Abstract/Keywords layout: move into two-column section (true IEEE format)
Abstract and Keywords were previously placed in the single-column title
block, spanning the full page width. Corrected to appear as the first
content of the two-column section, confined to one column's width,
matching standard IEEE conference paper format.
</commit_message>
<xml_diff>
--- a/paper/RepairBranch_IEEE_Research_Paper.docx
+++ b/paper/RepairBranch_IEEE_Research_Paper.docx
@@ -60,60 +60,6 @@
           <w:szCs w:val="20"/>
         </w:rPr>
         <w:t xml:space="preserve">email@example.com</w:t>
-      </w:r>
-    </w:p>
-    <w:p>
-      <w:pPr>
-        <w:spacing w:after="200"/>
-        <w:jc w:val="both"/>
-      </w:pPr>
-      <w:r>
-        <w:rPr>
-          <w:rFonts w:ascii="Times New Roman" w:cs="Times New Roman" w:eastAsia="Times New Roman" w:hAnsi="Times New Roman"/>
-          <w:b/>
-          <w:bCs/>
-          <w:i/>
-          <w:iCs/>
-          <w:sz w:val="20"/>
-          <w:szCs w:val="20"/>
-        </w:rPr>
-        <w:t xml:space="preserve">Abstract—</w:t>
-      </w:r>
-      <w:r>
-        <w:rPr>
-          <w:rFonts w:ascii="Times New Roman" w:cs="Times New Roman" w:eastAsia="Times New Roman" w:hAnsi="Times New Roman"/>
-          <w:sz w:val="20"/>
-          <w:szCs w:val="20"/>
-        </w:rPr>
-        <w:t xml:space="preserve">Predictive maintenance has shifted from reactive failure detection toward prognostic Remaining Useful Life (RUL) estimation, yet most systems stop at prediction without evaluating the consequences of intervening at different points along an asset's degradation trajectory. This paper presents RepairBranch, coupling RUL prognostics with counterfactual maintenance-timing replay, evaluated on the NASA C-MAPSS FD001 turbofan benchmark (100 training, 100 test engines; single operating condition and fault mode). A Random Forest regressor on rolling-window sensor features, validated with grouped five-fold cross-validation, predicts RUL with test RMSE 18.9 cycles, MAE 13.6, R-squared 0.794, and NASA PHM08 score 1044.1, with one lead sensor dominating feature importance. A counterfactual replay engine then mechanistically re-simulates each engine's own observed degradation increments, rather than a trained surrogate, from a partially restored baseline at three repair timings: fifty, seventy, and eighty-five percent of observed life. Later repairs consistently yield larger simulated life extension, traced to the back-loaded, accelerating shape of the degradation curves, where a fixed restoration fraction removes more accumulated damage once a trajectory enters its steep late-life phase. An illustrative cost model combining failure, repair, and per-cycle costs shows positive net benefit under every scenario, highest for late repair. No published work is known to combine mechanistic counterfactual replay of maintenance timing with cross-validated RUL prognostics on a public benchmark. Limitations include FD001's single condition, a tree-ensemble baseline, and illustrative cost figures. These results indicate that disciplined, mechanistic counterfactual replay is a practical route to maintenance-timing decision support that point-prediction RUL systems do not by themselves provide.</w:t>
-      </w:r>
-    </w:p>
-    <w:p>
-      <w:pPr>
-        <w:spacing w:after="200"/>
-        <w:jc w:val="both"/>
-      </w:pPr>
-      <w:r>
-        <w:rPr>
-          <w:rFonts w:ascii="Times New Roman" w:cs="Times New Roman" w:eastAsia="Times New Roman" w:hAnsi="Times New Roman"/>
-          <w:b/>
-          <w:bCs/>
-          <w:i/>
-          <w:iCs/>
-          <w:sz w:val="20"/>
-          <w:szCs w:val="20"/>
-        </w:rPr>
-        <w:t xml:space="preserve">Keywords—</w:t>
-      </w:r>
-      <w:r>
-        <w:rPr>
-          <w:rFonts w:ascii="Times New Roman" w:cs="Times New Roman" w:eastAsia="Times New Roman" w:hAnsi="Times New Roman"/>
-          <w:i/>
-          <w:iCs/>
-          <w:sz w:val="20"/>
-          <w:szCs w:val="20"/>
-        </w:rPr>
-        <w:t xml:space="preserve">Predictive Maintenance, Remaining Useful Life, Counterfactual Simulation, Digital Twin, Turbofan Engine Prognostics, Random Forest, NASA C-MAPSS, Maintenance Scheduling, Mechanistic Re-Simulation, Cost-Benefit Analysis</w:t>
       </w:r>
     </w:p>
     <w:p>
@@ -127,6 +73,60 @@
           <w:docGrid w:linePitch="360"/>
         </w:sectPr>
       </w:pPr>
+    </w:p>
+    <w:p>
+      <w:pPr>
+        <w:spacing w:after="200"/>
+        <w:jc w:val="both"/>
+      </w:pPr>
+      <w:r>
+        <w:rPr>
+          <w:rFonts w:ascii="Times New Roman" w:cs="Times New Roman" w:eastAsia="Times New Roman" w:hAnsi="Times New Roman"/>
+          <w:b/>
+          <w:bCs/>
+          <w:i/>
+          <w:iCs/>
+          <w:sz w:val="20"/>
+          <w:szCs w:val="20"/>
+        </w:rPr>
+        <w:t xml:space="preserve">Abstract—</w:t>
+      </w:r>
+      <w:r>
+        <w:rPr>
+          <w:rFonts w:ascii="Times New Roman" w:cs="Times New Roman" w:eastAsia="Times New Roman" w:hAnsi="Times New Roman"/>
+          <w:sz w:val="20"/>
+          <w:szCs w:val="20"/>
+        </w:rPr>
+        <w:t xml:space="preserve">Predictive maintenance has shifted from reactive failure detection toward prognostic Remaining Useful Life (RUL) estimation, yet most systems stop at prediction without evaluating the consequences of intervening at different points along an asset's degradation trajectory. This paper presents RepairBranch, coupling RUL prognostics with counterfactual maintenance-timing replay, evaluated on the NASA C-MAPSS FD001 turbofan benchmark (100 training, 100 test engines; single operating condition and fault mode). A Random Forest regressor on rolling-window sensor features, validated with grouped five-fold cross-validation, predicts RUL with test RMSE 18.9 cycles, MAE 13.6, R-squared 0.794, and NASA PHM08 score 1044.1, with one lead sensor dominating feature importance. A counterfactual replay engine then mechanistically re-simulates each engine's own observed degradation increments, rather than a trained surrogate, from a partially restored baseline at three repair timings: fifty, seventy, and eighty-five percent of observed life. Later repairs consistently yield larger simulated life extension, traced to the back-loaded, accelerating shape of the degradation curves, where a fixed restoration fraction removes more accumulated damage once a trajectory enters its steep late-life phase. An illustrative cost model combining failure, repair, and per-cycle costs shows positive net benefit under every scenario, highest for late repair. No published work is known to combine mechanistic counterfactual replay of maintenance timing with cross-validated RUL prognostics on a public benchmark. Limitations include FD001's single condition, a tree-ensemble baseline, and illustrative cost figures. These results indicate that disciplined, mechanistic counterfactual replay is a practical route to maintenance-timing decision support that point-prediction RUL systems do not by themselves provide.</w:t>
+      </w:r>
+    </w:p>
+    <w:p>
+      <w:pPr>
+        <w:spacing w:after="200"/>
+        <w:jc w:val="both"/>
+      </w:pPr>
+      <w:r>
+        <w:rPr>
+          <w:rFonts w:ascii="Times New Roman" w:cs="Times New Roman" w:eastAsia="Times New Roman" w:hAnsi="Times New Roman"/>
+          <w:b/>
+          <w:bCs/>
+          <w:i/>
+          <w:iCs/>
+          <w:sz w:val="20"/>
+          <w:szCs w:val="20"/>
+        </w:rPr>
+        <w:t xml:space="preserve">Keywords—</w:t>
+      </w:r>
+      <w:r>
+        <w:rPr>
+          <w:rFonts w:ascii="Times New Roman" w:cs="Times New Roman" w:eastAsia="Times New Roman" w:hAnsi="Times New Roman"/>
+          <w:i/>
+          <w:iCs/>
+          <w:sz w:val="20"/>
+          <w:szCs w:val="20"/>
+        </w:rPr>
+        <w:t xml:space="preserve">Predictive Maintenance, Remaining Useful Life, Counterfactual Simulation, Digital Twin, Turbofan Engine Prognostics, Random Forest, NASA C-MAPSS, Maintenance Scheduling, Mechanistic Re-Simulation, Cost-Benefit Analysis</w:t>
+      </w:r>
     </w:p>
     <w:p>
       <w:pPr>

</xml_diff>